<commit_message>
Make digital analytics resume more natural
</commit_message>
<xml_diff>
--- a/resume/Christopher-Landaverde-Classy-Llama-Digital-Analytics-Integrations-Specialist-Resume.docx
+++ b/resume/Christopher-Landaverde-Classy-Llama-Digital-Analytics-Integrations-Specialist-Resume.docx
@@ -61,7 +61,7 @@
           <w:i w:val="0"/>
           <w:sz w:val="17"/>
         </w:rPr>
-        <w:t>Digital Analytics &amp; Integrations Specialist | GA4, GTM, Shopify, BigQuery, Product Feeds</w:t>
+        <w:t>Digital Analytics &amp; Integrations Specialist | GA4, GTM, Shopify, BigQuery &amp; Reporting</w:t>
       </w:r>
     </w:p>
     <w:p>
@@ -93,7 +93,7 @@
           <w:i w:val="0"/>
           <w:sz w:val="16"/>
         </w:rPr>
-        <w:t>Client-facing digital analytics and MarTech specialist focused on making marketing, ecommerce, and revenue data trustworthy. Hands-on across GA4, Google Tag Manager, server-side tagging, data layer specs, conversion APIs, BigQuery/SQL, Looker Studio, product-feed operations, and CRM/ad-platform integrations. Comfortable owning messy analytics implementations end to end: auditing what is broken, writing practical remediation roadmaps, partnering with developers, validating before reporting, and explaining the business impact to non-technical stakeholders.</w:t>
+        <w:t>Digital analytics specialist who helps teams trust the numbers they use to make decisions. I build and clean up GA4, Google Tag Manager, Shopify/ecommerce tracking, server-side tagging, BigQuery/SQL reporting, Looker Studio dashboards, and CRM/ad-platform integrations. I’m comfortable walking into messy analytics setups, finding what is broken, working with developers to fix it, and explaining the impact clearly to marketers, operators, and client stakeholders.</w:t>
       </w:r>
     </w:p>
     <w:p>
@@ -126,7 +126,7 @@
           <w:i w:val="0"/>
           <w:sz w:val="15"/>
         </w:rPr>
-        <w:t xml:space="preserve">GA4 + GTM implementation: </w:t>
+        <w:t xml:space="preserve">Measurement implementation: </w:t>
       </w:r>
       <w:r>
         <w:rPr>
@@ -135,7 +135,7 @@
           <w:i w:val="0"/>
           <w:sz w:val="15"/>
         </w:rPr>
-        <w:t>GA4 properties, event taxonomies, key events, custom dimensions, data streams, web/server-side GTM containers, triggers, variables, consent mode, QA, and version discipline</w:t>
+        <w:t>GA4, Google Tag Manager, data layer specs, ecommerce events, conversion/key events, consent mode, server-side tagging, QA, and tracking documentation</w:t>
       </w:r>
     </w:p>
     <w:p>
@@ -150,7 +150,7 @@
           <w:i w:val="0"/>
           <w:sz w:val="15"/>
         </w:rPr>
-        <w:t xml:space="preserve">B2B ecommerce + Shopify: </w:t>
+        <w:t xml:space="preserve">Ecommerce + Shopify: </w:t>
       </w:r>
       <w:r>
         <w:rPr>
@@ -159,7 +159,7 @@
           <w:i w:val="0"/>
           <w:sz w:val="15"/>
         </w:rPr>
-        <w:t>Shopify/ecommerce measurement, product-detail and checkout events, quote/RFQ-style funnels, account registrations, lead forms, ecommerce attribution, and revenue-path reporting</w:t>
+        <w:t>Shopify and ecommerce tracking for product views, cart behavior, checkout steps, purchases, lead forms, quote/RFQ-style funnels, and revenue reporting</w:t>
       </w:r>
     </w:p>
     <w:p>
@@ -174,7 +174,7 @@
           <w:i w:val="0"/>
           <w:sz w:val="15"/>
         </w:rPr>
-        <w:t xml:space="preserve">Product feeds + Merchant Center: </w:t>
+        <w:t xml:space="preserve">Feeds + Merchant Center: </w:t>
       </w:r>
       <w:r>
         <w:rPr>
@@ -183,7 +183,7 @@
           <w:i w:val="0"/>
           <w:sz w:val="15"/>
         </w:rPr>
-        <w:t>Google Merchant Center, Shopping/PMax data needs, product-feed QA, structured data, catalog attributes, disapprovals, supplemental-feed logic, and feed-health reporting</w:t>
+        <w:t>Google Merchant Center, product-feed troubleshooting, Shopping/PMax data needs, structured product data, disapprovals, and catalog-quality checks</w:t>
       </w:r>
     </w:p>
     <w:p>
@@ -198,7 +198,7 @@
           <w:i w:val="0"/>
           <w:sz w:val="15"/>
         </w:rPr>
-        <w:t xml:space="preserve">Pixels + Conversion APIs: </w:t>
+        <w:t xml:space="preserve">Ad platform tracking: </w:t>
       </w:r>
       <w:r>
         <w:rPr>
@@ -207,7 +207,7 @@
           <w:i w:val="0"/>
           <w:sz w:val="15"/>
         </w:rPr>
-        <w:t>Google Ads, Meta, LinkedIn, Microsoft Ads/Bing, enhanced conversions, offline conversion flows, server-side tracking, Stape, consent-aware tagging, and signal-quality validation</w:t>
+        <w:t>Google Ads, Meta, LinkedIn, and Microsoft Ads conversion tracking, enhanced conversions, offline conversion imports, server-side tracking, and signal-quality checks</w:t>
       </w:r>
     </w:p>
     <w:p>
@@ -222,7 +222,7 @@
           <w:i w:val="0"/>
           <w:sz w:val="15"/>
         </w:rPr>
-        <w:t xml:space="preserve">BigQuery / SQL / dashboards: </w:t>
+        <w:t xml:space="preserve">Reporting + reconciliation: </w:t>
       </w:r>
       <w:r>
         <w:rPr>
@@ -231,7 +231,7 @@
           <w:i w:val="0"/>
           <w:sz w:val="15"/>
         </w:rPr>
-        <w:t>GA4 BigQuery exports, SQL transformation logic, Looker Studio, Power BI, QuickSight, Metabase, ERP/CRM/ecommerce reconciliation, KPI definitions, and executive dashboards</w:t>
+        <w:t>BigQuery, SQL, Looker Studio, Power BI, QuickSight, Metabase, CRM/ecommerce/ERP reconciliation, KPI definitions, and dashboards that answer real business questions</w:t>
       </w:r>
     </w:p>
     <w:p>
@@ -246,7 +246,7 @@
           <w:i w:val="0"/>
           <w:sz w:val="15"/>
         </w:rPr>
-        <w:t xml:space="preserve">Client consulting: </w:t>
+        <w:t xml:space="preserve">Client-facing work: </w:t>
       </w:r>
       <w:r>
         <w:rPr>
@@ -255,7 +255,7 @@
           <w:i w:val="0"/>
           <w:sz w:val="15"/>
         </w:rPr>
-        <w:t>discovery, scoping, stakeholder calls, documentation, developer handoff, roadmap creation, prioritization, and plain-English explanations of technical tracking issues</w:t>
+        <w:t>discovery calls, scope definition, stakeholder updates, developer handoffs, implementation notes, and clear explanations when the data does not line up</w:t>
       </w:r>
     </w:p>
     <w:p>
@@ -317,7 +317,7 @@
           <w:i w:val="0"/>
           <w:sz w:val="16"/>
         </w:rPr>
-        <w:t>Founded a GTM systems and MarTech consultancy delivering measurement infrastructure, consent architecture, CRM/workflow automation, and customer data activation for 20+ clients across ecommerce, B2B SaaS, healthcare, and agency environments.</w:t>
+        <w:t>Run a small GTM systems and analytics consultancy supporting 20+ clients across ecommerce, B2B SaaS, healthcare, and agency environments.</w:t>
       </w:r>
     </w:p>
     <w:p>
@@ -347,7 +347,7 @@
           <w:i w:val="0"/>
           <w:sz w:val="16"/>
         </w:rPr>
-        <w:t>Support ecommerce and Shopify-adjacent measurement needs including product-page behavior, cart/checkout events, lead and quote forms, catalog/feed data quality, Shopping campaign inputs, and cross-platform conversion validation.</w:t>
+        <w:t>Support ecommerce and Shopify measurement needs including product-page behavior, cart and checkout events, lead and quote forms, feed/catalog data quality, Shopping campaign inputs, and cross-platform conversion checks.</w:t>
       </w:r>
     </w:p>
     <w:p>
@@ -362,7 +362,7 @@
           <w:i w:val="0"/>
           <w:sz w:val="16"/>
         </w:rPr>
-        <w:t>Audit broken analytics setups, identify duplicate/missing conversions, document data layer requirements, QA developer implementations, and translate remediation work into prioritized roadmaps for clients.</w:t>
+        <w:t>Audit analytics setups, find duplicate or missing conversions, write data layer requirements, QA developer implementations, and turn the fixes into practical roadmaps clients can actually follow.</w:t>
       </w:r>
     </w:p>
     <w:p>
@@ -421,7 +421,7 @@
           <w:i w:val="0"/>
           <w:sz w:val="16"/>
         </w:rPr>
-        <w:t>QA form logic, personalization, workflow triggers, suppression rules, attribution fields, and reporting paths to improve lifecycle communication and sales/marketing handoffs.</w:t>
+        <w:t>QA form logic, workflow triggers, suppression rules, attribution fields, and reporting paths so campaign data is cleaner and easier to trust.</w:t>
       </w:r>
     </w:p>
     <w:p>
@@ -436,7 +436,7 @@
           <w:i w:val="0"/>
           <w:sz w:val="16"/>
         </w:rPr>
-        <w:t>Partner with non-technical stakeholders to turn campaign, sales, and reporting needs into clean HubSpot configuration, measurable workflows, and repeatable operating processes.</w:t>
+        <w:t>Work with non-technical stakeholders to turn campaign, sales, and reporting requests into clean HubSpot setup and repeatable operating processes.</w:t>
       </w:r>
     </w:p>
     <w:p>
@@ -480,7 +480,7 @@
           <w:i w:val="0"/>
           <w:sz w:val="16"/>
         </w:rPr>
-        <w:t>Owned MarTech and marketing analytics infrastructure across GA4, Google Tag Manager, cookie consent, attribution tracking, campaign event tracking, and A/B test measurement.</w:t>
+        <w:t>Owned GA4, Google Tag Manager, cookie consent, attribution tracking, campaign events, and A/B test measurement for the marketing team.</w:t>
       </w:r>
     </w:p>
     <w:p>
@@ -510,7 +510,7 @@
           <w:i w:val="0"/>
           <w:sz w:val="16"/>
         </w:rPr>
-        <w:t>Managed integrations between HubSpot, Salesforce, CRM, and data platforms, including API workflows, synchronization, governance, enrichment, and automation through Zapier and Make.</w:t>
+        <w:t>Managed HubSpot, Salesforce, CRM, and data-platform integrations, including API workflows, sync rules, enrichment, and automation through Zapier and Make.</w:t>
       </w:r>
     </w:p>
     <w:p>
@@ -525,7 +525,7 @@
           <w:i w:val="0"/>
           <w:sz w:val="16"/>
         </w:rPr>
-        <w:t>Provided technical tracking guidance, platform training, and MarTech recommendations for marketing, sales, RevOps, product/engineering, and data teams.</w:t>
+        <w:t>Gave practical tracking guidance and platform training to marketing, sales, RevOps, product, engineering, and data stakeholders.</w:t>
       </w:r>
     </w:p>
     <w:p>
@@ -569,7 +569,7 @@
           <w:i w:val="0"/>
           <w:sz w:val="16"/>
         </w:rPr>
-        <w:t>Advised healthcare and regulated clients on Google Analytics versus Piwik PRO strategy based on compliance, data ownership, reporting requirements, and long-term maintainability.</w:t>
+        <w:t>Advised healthcare and regulated clients on whether Google Analytics or Piwik PRO better fit their compliance, data ownership, and reporting needs.</w:t>
       </w:r>
     </w:p>
     <w:p>
@@ -599,7 +599,7 @@
           <w:i w:val="0"/>
           <w:sz w:val="16"/>
         </w:rPr>
-        <w:t>Presented analytics governance recommendations and platform tradeoffs to stakeholders evaluating compliant measurement options.</w:t>
+        <w:t>Presented clear platform tradeoffs and analytics governance recommendations to stakeholders evaluating compliant measurement options.</w:t>
       </w:r>
     </w:p>
     <w:p>
@@ -643,7 +643,7 @@
           <w:i w:val="0"/>
           <w:sz w:val="16"/>
         </w:rPr>
-        <w:t>Led Matomo implementation discovery and authored a roadmap covering dashboard architecture, reporting framework, event taxonomy, Tag Manager setup, and Angular SPA tracking requirements.</w:t>
+        <w:t>Led Matomo implementation discovery and wrote a roadmap for dashboards, reporting, event taxonomy, Tag Manager setup, and Angular SPA tracking requirements.</w:t>
       </w:r>
     </w:p>
     <w:p>
@@ -658,7 +658,7 @@
           <w:i w:val="0"/>
           <w:sz w:val="16"/>
         </w:rPr>
-        <w:t>Researched SPA route-change tracking, tested event configurations, advised on HIPAA-conscious analytics practices, and completed implementation planning in under two months.</w:t>
+        <w:t>Researched SPA route-change tracking, tested event configurations, advised on HIPAA-conscious analytics practices, and finished implementation planning in under two months.</w:t>
       </w:r>
     </w:p>
     <w:p>
@@ -702,7 +702,7 @@
           <w:i w:val="0"/>
           <w:sz w:val="16"/>
         </w:rPr>
-        <w:t>Managed GA/GTM tracking infrastructure across web analytics, paid media, and reporting platforms during an 8-month engagement.</w:t>
+        <w:t>Managed GA/GTM tracking across web analytics, paid media, and reporting platforms during an 8-month engagement.</w:t>
       </w:r>
     </w:p>
     <w:p>
@@ -761,7 +761,7 @@
           <w:i w:val="0"/>
           <w:sz w:val="16"/>
         </w:rPr>
-        <w:t>Built BigQuery/SQL dashboards for support and myQ app KPIs, improving case-resolution efficiency by 15% through faster visibility into user behavior and operational performance.</w:t>
+        <w:t>Built BigQuery/SQL dashboards for support and myQ app KPIs, helping improve case-resolution efficiency by 15% through faster visibility into user behavior and operational performance.</w:t>
       </w:r>
     </w:p>
     <w:p>
@@ -776,7 +776,7 @@
           <w:i w:val="0"/>
           <w:sz w:val="16"/>
         </w:rPr>
-        <w:t>Managed national campaign analytics with GA4 and Kochava, tracking clicks, downloads, registrations, installs, and revenue-adjacent events to improve ad spend allocation and conversion analysis.</w:t>
+        <w:t>Managed national campaign analytics with GA4 and Kochava, tracking clicks, downloads, registrations, installs, and revenue-adjacent events for conversion analysis and ad spend decisions.</w:t>
       </w:r>
     </w:p>
     <w:p>
@@ -850,7 +850,7 @@
           <w:i w:val="0"/>
           <w:sz w:val="16"/>
         </w:rPr>
-        <w:t>Implemented Tealium and Google Tag Manager tracking solutions to improve campaign analytics precision, audience segmentation, and measurement consistency.</w:t>
+        <w:t>Implemented Tealium and Google Tag Manager tracking to improve campaign reporting, audience segmentation, and measurement consistency.</w:t>
       </w:r>
     </w:p>
     <w:p>
@@ -865,7 +865,7 @@
           <w:i w:val="0"/>
           <w:sz w:val="16"/>
         </w:rPr>
-        <w:t>Engineered a Databricks/SQL attribution pipeline from Kochava into BigQuery, reducing manual data processing time by 40%.</w:t>
+        <w:t>Built a Databricks/SQL attribution pipeline from Kochava into BigQuery, reducing manual data processing time by 40%.</w:t>
       </w:r>
     </w:p>
     <w:p>
@@ -909,7 +909,7 @@
           <w:i w:val="0"/>
           <w:sz w:val="16"/>
         </w:rPr>
-        <w:t>Supported a multi-domain GA4 migration by rebuilding event taxonomies and measurement structures to preserve enterprise reporting accuracy.</w:t>
+        <w:t>Supported a multi-domain GA4 migration by rebuilding event taxonomies and measurement structures so enterprise reports stayed usable after the move.</w:t>
       </w:r>
     </w:p>
     <w:p>

</xml_diff>